<commit_message>
fix: sumario condicional com numeracao sequencial quando sem subestacao
Made-with: Cursor
</commit_message>
<xml_diff>
--- a/templates/eletrico/v1/template.docx
+++ b/templates/eletrico/v1/template.docx
@@ -1114,6 +1114,23 @@
     </w:p>
     <w:p>
       <w:pPr>
+        <w:jc w:val="both"/>
+        <w:rPr>
+          <w:rFonts w:ascii="Arial" w:cs="Arial" w:eastAsia="Arial" w:hAnsi="Arial"/>
+          <w:highlight w:val="yellow"/>
+        </w:rPr>
+      </w:pPr>
+      <w:r>
+        <w:rPr>
+          <w:rFonts w:ascii="Arial" w:cs="Arial" w:eastAsia="Arial" w:hAnsi="Arial"/>
+          <w:highlight w:val="yellow"/>
+          <w:rtl w:val="0"/>
+        </w:rPr>
+        <w:t xml:space="preserve">{%p if energia.tem_subestacao %}</w:t>
+      </w:r>
+    </w:p>
+    <w:p>
+      <w:pPr>
         <w:tabs>
           <w:tab w:val="left" w:leader="none" w:pos="-1843"/>
           <w:tab w:val="left" w:leader="none" w:pos="851"/>
@@ -1196,11 +1213,6 @@
         </w:rPr>
         <w:t xml:space="preserve">4.3. ATERRAMENTO……………………………………………………………………………………8</w:t>
       </w:r>
-      <w:r>
-        <w:rPr>
-          <w:rtl w:val="0"/>
-        </w:rPr>
-      </w:r>
     </w:p>
     <w:p>
       <w:pPr>
@@ -1226,11 +1238,6 @@
         </w:rPr>
         <w:t xml:space="preserve">4.4. ELETRODUTOS, LEITOS E CANALETAS……………………………………………………...8</w:t>
       </w:r>
-      <w:r>
-        <w:rPr>
-          <w:rtl w:val="0"/>
-        </w:rPr>
-      </w:r>
     </w:p>
     <w:p>
       <w:pPr>
@@ -1256,11 +1263,6 @@
         </w:rPr>
         <w:t xml:space="preserve">4.5. CONDUTORES……………………………………………………………………………………...8</w:t>
       </w:r>
-      <w:r>
-        <w:rPr>
-          <w:rtl w:val="0"/>
-        </w:rPr>
-      </w:r>
     </w:p>
     <w:p>
       <w:pPr>
@@ -1286,11 +1288,6 @@
         </w:rPr>
         <w:t xml:space="preserve">4.6. MEDIÇÃO DE ENERGIA ELÉTRICA…………………………………………………………….8</w:t>
       </w:r>
-      <w:r>
-        <w:rPr>
-          <w:rtl w:val="0"/>
-        </w:rPr>
-      </w:r>
     </w:p>
     <w:p>
       <w:pPr>
@@ -1316,11 +1313,6 @@
         </w:rPr>
         <w:t xml:space="preserve">4.7. CORES PADRONIZADAS…………………………………………………………………………8</w:t>
       </w:r>
-      <w:r>
-        <w:rPr>
-          <w:rtl w:val="0"/>
-        </w:rPr>
-      </w:r>
     </w:p>
     <w:p>
       <w:pPr>
@@ -1346,11 +1338,6 @@
         </w:rPr>
         <w:t xml:space="preserve">4.8. INSTALAÇÃO DE LUZ E FORÇA………………………………………………………………..9</w:t>
       </w:r>
-      <w:r>
-        <w:rPr>
-          <w:rtl w:val="0"/>
-        </w:rPr>
-      </w:r>
     </w:p>
     <w:p>
       <w:pPr>
@@ -1376,11 +1363,6 @@
         </w:rPr>
         <w:t xml:space="preserve">4.9. INSTALAÇÃO DE LUZ ESSENCIAL (GRUPO GERADOR)…………………………………10</w:t>
       </w:r>
-      <w:r>
-        <w:rPr>
-          <w:rtl w:val="0"/>
-        </w:rPr>
-      </w:r>
     </w:p>
     <w:p>
       <w:pPr>
@@ -1406,11 +1388,6 @@
         </w:rPr>
         <w:t xml:space="preserve">4.10. PROTEÇÃO CONTRA CHOQUES ELÉTRICOS E ATERRAMENTO…………………….11</w:t>
       </w:r>
-      <w:r>
-        <w:rPr>
-          <w:rtl w:val="0"/>
-        </w:rPr>
-      </w:r>
     </w:p>
     <w:p>
       <w:pPr>
@@ -1436,11 +1413,6 @@
         </w:rPr>
         <w:t xml:space="preserve">4.11. MONTAGEM DOS APARELHOS……………………………………………………………...12</w:t>
       </w:r>
-      <w:r>
-        <w:rPr>
-          <w:rtl w:val="0"/>
-        </w:rPr>
-      </w:r>
     </w:p>
     <w:p>
       <w:pPr>
@@ -1466,10 +1438,289 @@
         </w:rPr>
         <w:t xml:space="preserve">4.12. ITENS NÃO INCLUSOS…………………………………………………………………………13</w:t>
       </w:r>
-      <w:r>
-        <w:rPr>
-          <w:rtl w:val="0"/>
-        </w:rPr>
+    </w:p>
+    <w:p>
+      <w:pPr>
+        <w:jc w:val="both"/>
+        <w:rPr>
+          <w:rFonts w:ascii="Arial" w:cs="Arial" w:eastAsia="Arial" w:hAnsi="Arial"/>
+          <w:highlight w:val="yellow"/>
+        </w:rPr>
+      </w:pPr>
+      <w:r>
+        <w:rPr>
+          <w:rFonts w:ascii="Arial" w:cs="Arial" w:eastAsia="Arial" w:hAnsi="Arial"/>
+          <w:highlight w:val="yellow"/>
+          <w:rtl w:val="0"/>
+        </w:rPr>
+        <w:t xml:space="preserve">{%p else %}</w:t>
+      </w:r>
+    </w:p>
+    <w:p>
+      <w:pPr>
+        <w:tabs>
+          <w:tab w:val="left" w:leader="none" w:pos="-1843"/>
+          <w:tab w:val="left" w:leader="none" w:pos="851"/>
+        </w:tabs>
+        <w:spacing w:line="360" w:lineRule="auto"/>
+        <w:rPr>
+          <w:rFonts w:ascii="Arial" w:cs="Arial" w:eastAsia="Arial" w:hAnsi="Arial"/>
+          <w:b w:val="0"/>
+          <w:bCs w:val="0"/>
+          <w:vertAlign w:val="baseline"/>
+        </w:rPr>
+      </w:pPr>
+      <w:r>
+        <w:rPr>
+          <w:rFonts w:ascii="Arial" w:cs="Arial" w:eastAsia="Arial" w:hAnsi="Arial"/>
+          <w:b w:val="1"/>
+          <w:bCs w:val="1"/>
+          <w:vertAlign w:val="baseline"/>
+          <w:rtl w:val="0"/>
+        </w:rPr>
+        <w:t xml:space="preserve">4.2. ATERRAMENTO……………………………………………………………………………………8</w:t>
+      </w:r>
+    </w:p>
+    <w:p>
+      <w:pPr>
+        <w:tabs>
+          <w:tab w:val="left" w:leader="none" w:pos="-1843"/>
+          <w:tab w:val="left" w:leader="none" w:pos="851"/>
+        </w:tabs>
+        <w:spacing w:line="360" w:lineRule="auto"/>
+        <w:rPr>
+          <w:rFonts w:ascii="Arial" w:cs="Arial" w:eastAsia="Arial" w:hAnsi="Arial"/>
+          <w:b w:val="0"/>
+          <w:bCs w:val="0"/>
+          <w:vertAlign w:val="baseline"/>
+        </w:rPr>
+      </w:pPr>
+      <w:r>
+        <w:rPr>
+          <w:rFonts w:ascii="Arial" w:cs="Arial" w:eastAsia="Arial" w:hAnsi="Arial"/>
+          <w:b w:val="1"/>
+          <w:bCs w:val="1"/>
+          <w:vertAlign w:val="baseline"/>
+          <w:rtl w:val="0"/>
+        </w:rPr>
+        <w:t xml:space="preserve">4.3. ELETRODUTOS, LEITOS E CANALETAS……………………………………………………...8</w:t>
+      </w:r>
+    </w:p>
+    <w:p>
+      <w:pPr>
+        <w:tabs>
+          <w:tab w:val="left" w:leader="none" w:pos="-1843"/>
+          <w:tab w:val="left" w:leader="none" w:pos="851"/>
+        </w:tabs>
+        <w:spacing w:line="360" w:lineRule="auto"/>
+        <w:rPr>
+          <w:rFonts w:ascii="Arial" w:cs="Arial" w:eastAsia="Arial" w:hAnsi="Arial"/>
+          <w:b w:val="0"/>
+          <w:bCs w:val="0"/>
+          <w:vertAlign w:val="baseline"/>
+        </w:rPr>
+      </w:pPr>
+      <w:r>
+        <w:rPr>
+          <w:rFonts w:ascii="Arial" w:cs="Arial" w:eastAsia="Arial" w:hAnsi="Arial"/>
+          <w:b w:val="1"/>
+          <w:bCs w:val="1"/>
+          <w:vertAlign w:val="baseline"/>
+          <w:rtl w:val="0"/>
+        </w:rPr>
+        <w:t xml:space="preserve">4.4. CONDUTORES……………………………………………………………………………………...8</w:t>
+      </w:r>
+    </w:p>
+    <w:p>
+      <w:pPr>
+        <w:tabs>
+          <w:tab w:val="left" w:leader="none" w:pos="-1843"/>
+          <w:tab w:val="left" w:leader="none" w:pos="851"/>
+        </w:tabs>
+        <w:spacing w:line="360" w:lineRule="auto"/>
+        <w:rPr>
+          <w:rFonts w:ascii="Arial" w:cs="Arial" w:eastAsia="Arial" w:hAnsi="Arial"/>
+          <w:b w:val="0"/>
+          <w:bCs w:val="0"/>
+          <w:vertAlign w:val="baseline"/>
+        </w:rPr>
+      </w:pPr>
+      <w:r>
+        <w:rPr>
+          <w:rFonts w:ascii="Arial" w:cs="Arial" w:eastAsia="Arial" w:hAnsi="Arial"/>
+          <w:b w:val="1"/>
+          <w:bCs w:val="1"/>
+          <w:vertAlign w:val="baseline"/>
+          <w:rtl w:val="0"/>
+        </w:rPr>
+        <w:t xml:space="preserve">4.5. MEDIÇÃO DE ENERGIA ELÉTRICA…………………………………………………………….8</w:t>
+      </w:r>
+    </w:p>
+    <w:p>
+      <w:pPr>
+        <w:tabs>
+          <w:tab w:val="left" w:leader="none" w:pos="-1843"/>
+          <w:tab w:val="left" w:leader="none" w:pos="851"/>
+        </w:tabs>
+        <w:spacing w:line="360" w:lineRule="auto"/>
+        <w:rPr>
+          <w:rFonts w:ascii="Arial" w:cs="Arial" w:eastAsia="Arial" w:hAnsi="Arial"/>
+          <w:b w:val="0"/>
+          <w:bCs w:val="0"/>
+          <w:vertAlign w:val="baseline"/>
+        </w:rPr>
+      </w:pPr>
+      <w:r>
+        <w:rPr>
+          <w:rFonts w:ascii="Arial" w:cs="Arial" w:eastAsia="Arial" w:hAnsi="Arial"/>
+          <w:b w:val="1"/>
+          <w:bCs w:val="1"/>
+          <w:vertAlign w:val="baseline"/>
+          <w:rtl w:val="0"/>
+        </w:rPr>
+        <w:t xml:space="preserve">4.6. CORES PADRONIZADAS…………………………………………………………………………8</w:t>
+      </w:r>
+    </w:p>
+    <w:p>
+      <w:pPr>
+        <w:tabs>
+          <w:tab w:val="left" w:leader="none" w:pos="-1843"/>
+          <w:tab w:val="left" w:leader="none" w:pos="851"/>
+        </w:tabs>
+        <w:spacing w:line="360" w:lineRule="auto"/>
+        <w:rPr>
+          <w:rFonts w:ascii="Arial" w:cs="Arial" w:eastAsia="Arial" w:hAnsi="Arial"/>
+          <w:b w:val="0"/>
+          <w:bCs w:val="0"/>
+          <w:vertAlign w:val="baseline"/>
+        </w:rPr>
+      </w:pPr>
+      <w:r>
+        <w:rPr>
+          <w:rFonts w:ascii="Arial" w:cs="Arial" w:eastAsia="Arial" w:hAnsi="Arial"/>
+          <w:b w:val="1"/>
+          <w:bCs w:val="1"/>
+          <w:vertAlign w:val="baseline"/>
+          <w:rtl w:val="0"/>
+        </w:rPr>
+        <w:t xml:space="preserve">4.7. INSTALAÇÃO DE LUZ E FORÇA………………………………………………………………..9</w:t>
+      </w:r>
+    </w:p>
+    <w:p>
+      <w:pPr>
+        <w:tabs>
+          <w:tab w:val="left" w:leader="none" w:pos="-1843"/>
+          <w:tab w:val="left" w:leader="none" w:pos="851"/>
+        </w:tabs>
+        <w:spacing w:line="360" w:lineRule="auto"/>
+        <w:rPr>
+          <w:rFonts w:ascii="Arial" w:cs="Arial" w:eastAsia="Arial" w:hAnsi="Arial"/>
+          <w:b w:val="0"/>
+          <w:bCs w:val="0"/>
+          <w:vertAlign w:val="baseline"/>
+        </w:rPr>
+      </w:pPr>
+      <w:r>
+        <w:rPr>
+          <w:rFonts w:ascii="Arial" w:cs="Arial" w:eastAsia="Arial" w:hAnsi="Arial"/>
+          <w:b w:val="1"/>
+          <w:bCs w:val="1"/>
+          <w:vertAlign w:val="baseline"/>
+          <w:rtl w:val="0"/>
+        </w:rPr>
+        <w:t xml:space="preserve">4.8. INSTALAÇÃO DE LUZ ESSENCIAL (GRUPO GERADOR)…………………………………10</w:t>
+      </w:r>
+    </w:p>
+    <w:p>
+      <w:pPr>
+        <w:tabs>
+          <w:tab w:val="left" w:leader="none" w:pos="-1843"/>
+          <w:tab w:val="left" w:leader="none" w:pos="851"/>
+        </w:tabs>
+        <w:spacing w:line="360" w:lineRule="auto"/>
+        <w:rPr>
+          <w:rFonts w:ascii="Arial" w:cs="Arial" w:eastAsia="Arial" w:hAnsi="Arial"/>
+          <w:b w:val="0"/>
+          <w:bCs w:val="0"/>
+          <w:vertAlign w:val="baseline"/>
+        </w:rPr>
+      </w:pPr>
+      <w:r>
+        <w:rPr>
+          <w:rFonts w:ascii="Arial" w:cs="Arial" w:eastAsia="Arial" w:hAnsi="Arial"/>
+          <w:b w:val="1"/>
+          <w:bCs w:val="1"/>
+          <w:vertAlign w:val="baseline"/>
+          <w:rtl w:val="0"/>
+        </w:rPr>
+        <w:t xml:space="preserve">4.9. PROTEÇÃO CONTRA CHOQUES ELÉTRICOS E ATERRAMENTO…………………….11</w:t>
+      </w:r>
+    </w:p>
+    <w:p>
+      <w:pPr>
+        <w:tabs>
+          <w:tab w:val="left" w:leader="none" w:pos="-1843"/>
+          <w:tab w:val="left" w:leader="none" w:pos="851"/>
+        </w:tabs>
+        <w:spacing w:line="360" w:lineRule="auto"/>
+        <w:rPr>
+          <w:rFonts w:ascii="Arial" w:cs="Arial" w:eastAsia="Arial" w:hAnsi="Arial"/>
+          <w:b w:val="0"/>
+          <w:bCs w:val="0"/>
+          <w:vertAlign w:val="baseline"/>
+        </w:rPr>
+      </w:pPr>
+      <w:r>
+        <w:rPr>
+          <w:rFonts w:ascii="Arial" w:cs="Arial" w:eastAsia="Arial" w:hAnsi="Arial"/>
+          <w:b w:val="1"/>
+          <w:bCs w:val="1"/>
+          <w:vertAlign w:val="baseline"/>
+          <w:rtl w:val="0"/>
+        </w:rPr>
+        <w:t xml:space="preserve">4.10. MONTAGEM DOS APARELHOS……………………………………………………………...12</w:t>
+      </w:r>
+    </w:p>
+    <w:p>
+      <w:pPr>
+        <w:tabs>
+          <w:tab w:val="left" w:leader="none" w:pos="-1843"/>
+          <w:tab w:val="left" w:leader="none" w:pos="851"/>
+        </w:tabs>
+        <w:spacing w:line="360" w:lineRule="auto"/>
+        <w:rPr>
+          <w:rFonts w:ascii="Arial" w:cs="Arial" w:eastAsia="Arial" w:hAnsi="Arial"/>
+          <w:b w:val="0"/>
+          <w:bCs w:val="0"/>
+          <w:vertAlign w:val="baseline"/>
+        </w:rPr>
+      </w:pPr>
+      <w:r>
+        <w:rPr>
+          <w:rFonts w:ascii="Arial" w:cs="Arial" w:eastAsia="Arial" w:hAnsi="Arial"/>
+          <w:b w:val="1"/>
+          <w:bCs w:val="1"/>
+          <w:vertAlign w:val="baseline"/>
+          <w:rtl w:val="0"/>
+        </w:rPr>
+        <w:t xml:space="preserve">4.11. ITENS NÃO INCLUSOS…………………………………………………………………………13</w:t>
+      </w:r>
+    </w:p>
+    <w:p>
+      <w:pPr>
+        <w:jc w:val="both"/>
+        <w:rPr>
+          <w:rFonts w:ascii="Arial" w:cs="Arial" w:eastAsia="Arial" w:hAnsi="Arial"/>
+          <w:highlight w:val="yellow"/>
+        </w:rPr>
+      </w:pPr>
+      <w:r>
+        <w:rPr>
+          <w:rFonts w:ascii="Arial" w:cs="Arial" w:eastAsia="Arial" w:hAnsi="Arial"/>
+          <w:highlight w:val="yellow"/>
+          <w:rtl w:val="0"/>
+        </w:rPr>
+        <w:t xml:space="preserve">{%p endif %}</w:t>
       </w:r>
     </w:p>
     <w:p>

</xml_diff>

<commit_message>
trying to fix extraction
</commit_message>
<xml_diff>
--- a/templates/eletrico/v1/template.docx
+++ b/templates/eletrico/v1/template.docx
@@ -1340,6 +1340,11 @@
       </w:r>
     </w:p>
     <w:p>
+      <w:r>
+        <w:t>{%p if gerador.tem_gerador %}</w:t>
+      </w:r>
+    </w:p>
+    <w:p>
       <w:pPr>
         <w:tabs>
           <w:tab w:val="left" w:leader="none" w:pos="-1843"/>
@@ -1365,6 +1370,11 @@
       </w:r>
     </w:p>
     <w:p>
+      <w:r>
+        <w:t>{%p endif %}</w:t>
+      </w:r>
+    </w:p>
+    <w:p>
       <w:pPr>
         <w:tabs>
           <w:tab w:val="left" w:leader="none" w:pos="-1843"/>
@@ -1607,6 +1617,11 @@
       </w:r>
     </w:p>
     <w:p>
+      <w:r>
+        <w:t>{%p if gerador.tem_gerador %}</w:t>
+      </w:r>
+    </w:p>
+    <w:p>
       <w:pPr>
         <w:tabs>
           <w:tab w:val="left" w:leader="none" w:pos="-1843"/>
@@ -1629,6 +1644,11 @@
           <w:rtl w:val="0"/>
         </w:rPr>
         <w:t xml:space="preserve">4.8. INSTALAÇÃO DE LUZ ESSENCIAL (GRUPO GERADOR)…………………………………10</w:t>
+      </w:r>
+    </w:p>
+    <w:p>
+      <w:r>
+        <w:t>{%p endif %}</w:t>
       </w:r>
     </w:p>
     <w:p>
@@ -4685,6 +4705,11 @@
       </w:r>
     </w:p>
     <w:p>
+      <w:r>
+        <w:t>{%p if gerador.tem_gerador %}</w:t>
+      </w:r>
+    </w:p>
+    <w:p>
       <w:pPr>
         <w:keepNext w:val="0"/>
         <w:keepLines w:val="0"/>
@@ -4740,6 +4765,11 @@
           <w:rtl w:val="0"/>
         </w:rPr>
         <w:t xml:space="preserve">O empreendimento será atendido pelo sistema de geração de emergência através de grupo geradores a diesel com dimensionamento da infraestrutura dos painéis com níveis compatíveis de CC.</w:t>
+      </w:r>
+    </w:p>
+    <w:p>
+      <w:r>
+        <w:t>{%p endif %}</w:t>
       </w:r>
     </w:p>
     <w:p>
@@ -8500,6 +8530,11 @@
       </w:r>
     </w:p>
     <w:p>
+      <w:r>
+        <w:t>{%p if gerador.tem_gerador %}</w:t>
+      </w:r>
+    </w:p>
+    <w:p>
       <w:pPr>
         <w:numPr>
           <w:ilvl w:val="1"/>
@@ -9214,6 +9249,11 @@
         <w:rPr>
           <w:rtl w:val="0"/>
         </w:rPr>
+      </w:r>
+    </w:p>
+    <w:p>
+      <w:r>
+        <w:t>{%p endif %}</w:t>
       </w:r>
     </w:p>
     <w:p>

</xml_diff>

<commit_message>
fix: improve generated memorial review flow
</commit_message>
<xml_diff>
--- a/templates/eletrico/v1/template.docx
+++ b/templates/eletrico/v1/template.docx
@@ -5139,7 +5139,7 @@
           <w:rFonts w:ascii="Arial" w:cs="Arial" w:eastAsia="Arial" w:hAnsi="Arial"/>
           <w:rtl w:val="0"/>
         </w:rPr>
-        <w:t xml:space="preserve">alimentada através da entrada de MT-13.8kV.</w:t>
+        <w:t xml:space="preserve">alimentada através da entrada de MT-{{ mt.tensao_kv }}kV.</w:t>
       </w:r>
     </w:p>
     <w:p>
@@ -5197,7 +5197,7 @@
           <w:rFonts w:ascii="Arial" w:cs="Arial" w:eastAsia="Arial" w:hAnsi="Arial"/>
           <w:rtl w:val="0"/>
         </w:rPr>
-        <w:t xml:space="preserve">O suprimento de energia para as instalações será alimentado diretamente pela rede de distribuição em MT-13.8kV, não sendo prevista subestação na edificação.</w:t>
+        <w:t xml:space="preserve">O suprimento de energia para as instalações será alimentado diretamente pela rede de distribuição em MT-{{ mt.tensao_kv }}kV, não sendo prevista subestação na edificação.</w:t>
       </w:r>
     </w:p>
     <w:p>

</xml_diff>